<commit_message>
feat: clean g0 markers from sample docx and redesign UI to be prominent and attractive
</commit_message>
<xml_diff>
--- a/DeGocTron.docx
+++ b/DeGocTron.docx
@@ -5,22 +5,6 @@
     <w:p>
       <w:pPr>
         <w:spacing w:before="100"/>
-        <w:rPr>
-          <w:b/>
-          <w:bCs/>
-        </w:rPr>
-      </w:pPr>
-      <w:r>
-        <w:rPr>
-          <w:b/>
-          <w:bCs/>
-        </w:rPr>
-        <w:t>&lt;g0#1&gt;</w:t>
-      </w:r>
-    </w:p>
-    <w:p>
-      <w:pPr>
-        <w:spacing w:before="100"/>
       </w:pPr>
       <w:r>
         <w:rPr>
@@ -1610,22 +1594,6 @@
     <w:p>
       <w:pPr>
         <w:spacing w:before="100"/>
-        <w:rPr>
-          <w:b/>
-          <w:bCs/>
-        </w:rPr>
-      </w:pPr>
-      <w:r>
-        <w:rPr>
-          <w:b/>
-          <w:bCs/>
-        </w:rPr>
-        <w:t>&lt;g0#2&gt;</w:t>
-      </w:r>
-    </w:p>
-    <w:p>
-      <w:pPr>
-        <w:spacing w:before="100"/>
       </w:pPr>
       <w:r>
         <w:rPr>
@@ -2236,22 +2204,6 @@
           <w:u w:val="single"/>
         </w:rPr>
         <w:t>Khối lượng chất rắn thu được khi cô cạn luôn lớn hơn khối lượng ester ban đầu nếu dùng NaOH dư.</w:t>
-      </w:r>
-    </w:p>
-    <w:p>
-      <w:pPr>
-        <w:spacing w:before="100"/>
-        <w:rPr>
-          <w:b/>
-          <w:bCs/>
-        </w:rPr>
-      </w:pPr>
-      <w:r>
-        <w:rPr>
-          <w:b/>
-          <w:bCs/>
-        </w:rPr>
-        <w:t>&lt;g0#3&gt;</w:t>
       </w:r>
     </w:p>
     <w:p>

</xml_diff>